<commit_message>
build(tcc): regenera entregáveis alinhados ao núcleo (3 pptx + 2 docx)
Saídas das apresentações e dos docx (resultados preliminares, guia de estudo)
regeradas a partir dos geradores já alinhados ao núcleo de 4.

Co-Authored-By: Claude Opus 4.8 <noreply@anthropic.com>
</commit_message>
<xml_diff>
--- a/entregaveis/Resultados_Preliminares_TCC.docx
+++ b/entregaveis/Resultados_Preliminares_TCC.docx
@@ -78,7 +78,7 @@
         <w:jc w:val="both"/>
       </w:pPr>
       <w:r>
-        <w:t>A desigualdade racial no mercado de trabalho brasileiro foi investigada com a PNAD Contínua (2016–2025; 7.694.198 observações da população economicamente ativa), integrando econometria multinível, aprendizado de máquina, análise de redes e pesquisa operacional. Os resultados preliminares indicam que a discriminação opera em camadas: uma barreira de acesso a ocupações qualificadas (GLMM logístico, OR=0,693), uma penalidade salarial residual e um teto de vidro que se agrava no topo da distribuição (OR de acesso ao decil superior = 0,457). Mais de metade do diferencial salarial é mediada pelo contexto de moradia (UPA), e modelos de inclinação aleatória mostram que tanto a penalidade de acesso quanto a salarial variam significativamente entre os estados. A pesquisa operacional traduz o diagnóstico em priorização de políticas, com ganho de focalização territorial.</w:t>
+        <w:t>A desigualdade racial no mercado de trabalho brasileiro foi investigada com a PNAD Contínua (2016–2025; 7.694.198 observações da população economicamente ativa), integrando econometria multinível, decomposições do gap e aprendizado de máquina interpretável. Os resultados preliminares indicam que a discriminação opera em camadas: uma barreira de acesso a ocupações qualificadas (GLMM logístico, OR=0,693), uma penalidade salarial residual e um teto de vidro que se agrava no topo da distribuição (OR de acesso ao decil superior = 0,457). Mais de metade do diferencial salarial é mediada pelo contexto de moradia (UPA); a decomposição de Oaxaca-Blinder atribui 83,8% do gap a diferenças de dotações (sobretudo de ocupação) e 16,2% à parcela não explicada, enquanto a penalidade recai de forma agravada sobre a mulher negra (penalidade interseccional de +9,5 p.p.).</w:t>
       </w:r>
     </w:p>
     <w:p>
@@ -96,7 +96,7 @@
         <w:rPr>
           <w:rFonts w:ascii="Times New Roman" w:hAnsi="Times New Roman"/>
         </w:rPr>
-        <w:t>gap salarial racial; modelos hierárquicos; teto de vidro; segregação residencial; pesquisa operacional.</w:t>
+        <w:t>gap salarial racial; modelos hierárquicos; teto de vidro; decomposição de Oaxaca-Blinder; interseccionalidade.</w:t>
       </w:r>
     </w:p>
     <w:p>
@@ -136,7 +136,7 @@
         <w:jc w:val="both"/>
       </w:pPr>
       <w:r>
-        <w:t>A literatura internacional sugere que a discriminação não é um evento único na contratação, mas um sistema de barreiras que se reforçam: exclusão de acesso a ocupações qualificadas (Pager, 2007), efeitos de vizinhança e segregação residencial (Wilson, 1987; Sampson, 1997) e exclusão das redes sociais que convertem credenciais em oportunidades (Granovetter, 1973; Burt, 2004). Tratados isoladamente, esses mecanismos têm sido difíceis de quantificar de forma integrada e em escala nacional.</w:t>
+        <w:t>A literatura internacional sugere que a discriminação não é um evento único na contratação, mas um sistema de barreiras que se reforçam: exclusão de acesso a ocupações qualificadas (Pager, 2007), efeitos de vizinhança e segregação residencial (Wilson, 1987; Sampson, 1997) e barreiras na conversão de credenciais em ocupações qualificadas (Pager, 2007). Tratados isoladamente, esses mecanismos têm sido difíceis de quantificar de forma integrada e em escala nacional.</w:t>
       </w:r>
     </w:p>
     <w:p>
@@ -145,7 +145,7 @@
         <w:jc w:val="both"/>
       </w:pPr>
       <w:r>
-        <w:t>Este trabalho enfrenta essa lacuna combinando, sobre a série completa da PNAD Contínua, modelos lineares hierárquicos (HLM), modelos logísticos multiníveis (GLMM), decomposição de Oaxaca-Blinder, regressão quantílica, aprendizado de máquina com valores SHAP, análise de redes sociais (SNA) e pesquisa operacional. A convergência de métodos independentes sobre o mesmo conjunto de dados permite distinguir os mecanismos da desigualdade e testar sua robustez.</w:t>
+        <w:t>Este trabalho enfrenta essa lacuna combinando, sobre a série completa da PNAD Contínua, quatro métodos complementares — modelos lineares hierárquicos (HLM), decomposição de Oaxaca-Blinder, regressão quantílica com RIF e modelos logísticos multiníveis (GLMM) —, validados por aprendizado de máquina com valores SHAP. A convergência de métodos independentes sobre o mesmo conjunto de dados permite distinguir os mecanismos da desigualdade e testar sua robustez.</w:t>
       </w:r>
     </w:p>
     <w:p>
@@ -154,7 +154,7 @@
         <w:jc w:val="both"/>
       </w:pPr>
       <w:r>
-        <w:t>O objetivo deste trabalho é identificar, isolar e quantificar os mecanismos da desigualdade racial de rendimentos e de acesso ocupacional no Brasil, avaliando sua heterogeneidade geográfica e setorial e traduzindo o diagnóstico em recomendações de política priorizadas por métodos de pesquisa operacional.</w:t>
+        <w:t>O objetivo deste trabalho é identificar, isolar e quantificar os mecanismos da desigualdade racial de rendimentos e de acesso ocupacional no Brasil, distinguindo a parcela de composição da parcela de discriminação e traduzindo o diagnóstico em implicações de política focadas no acesso a ocupações qualificadas.</w:t>
       </w:r>
     </w:p>
     <w:p>
@@ -213,7 +213,7 @@
         <w:jc w:val="both"/>
       </w:pPr>
       <w:r>
-        <w:t>Estimaram-se modelos lineares hierárquicos (HLM) para o logaritmo do rendimento, com efeitos aleatórios de UPA e UF, decompondo o gap bruto em mediação contextual e penalidade residual (Raudenbush; Bryk, 2002). O acesso a ocupações qualificadas e ao topo da distribuição de renda foi modelado por GLMM logístico (lme4::glmer, R), com efeito aleatório de UPA. Modelos de inclinação aleatória (random slope) de raça e de gênero por UF testaram a heterogeneidade geográfica do efeito (teste de fronteira de Stram e Lee, 1994), estimados também separadamente para os setores público e privado.</w:t>
+        <w:t>Estimaram-se modelos lineares hierárquicos (HLM) para o logaritmo do rendimento, com efeitos aleatórios de UPA e UF, decompondo o gap bruto em mediação contextual e penalidade residual (Raudenbush; Bryk, 2002). O acesso a ocupações qualificadas e ao topo da distribuição de renda foi modelado por GLMM logístico (lme4::glmer, R), com efeito aleatório de UPA. A robustez dos achados foi avaliada por E-values (VanderWeele; Ding, 2017).</w:t>
       </w:r>
     </w:p>
     <w:p>
@@ -273,7 +273,7 @@
           <w:i/>
           <w:sz w:val="24"/>
         </w:rPr>
-        <w:t>Redes sociais e pesquisa operacional</w:t>
+        <w:t>Sensibilidade e interseccionalidade</w:t>
       </w:r>
     </w:p>
     <w:p>
@@ -282,7 +282,7 @@
         <w:jc w:val="both"/>
       </w:pPr>
       <w:r>
-        <w:t>A análise de redes sociais (SNA) modelou a co-presença ocupacional como grafo, medindo isolamento estrutural (constraint de Burt) e capacidade de corretagem (betweenness) por grupo. Por fim, a pesquisa operacional (TOPSIS, AHP e programação linear; Saaty, 1980; Hwang; Yoon, 1981) traduziu os coeficientes confirmados em priorização e alocação ótima de políticas, inclusive em versão regionalizada por UF.</w:t>
+        <w:t>A robustez do resíduo racial foi avaliada por E-values (VanderWeele; Ding, 2017), que quantificam quanto um confundidor não-observado precisaria pesar para anular o efeito. A decomposição interseccional (raça × gênero) formaliza a penalidade específica da combinação dos eixos (Crenshaw, 1989), distinguindo-a da soma dos efeitos isolados.</w:t>
       </w:r>
     </w:p>
     <w:p>
@@ -599,7 +599,7 @@
         <w:jc w:val="both"/>
       </w:pPr>
       <w:r>
-        <w:t>Por que as dotações são desiguais? A segunda camada responde: pelo LUGAR. No modelo hierárquico, mais da metade do gap salarial é mediada pelo contexto de moradia (UPA), e o aprendizado de máquina confirma-o de forma independente e não-paramétrica: entre todos os preditores do rendimento, a RENDA MÉDIA DO BAIRRO é o mais importante (Figura 3) — acima da escolaridade e de qualquer atributo individual. A raça, isoladamente, tem peso preditivo direto modesto justamente porque opera ATRAVÉS do território: a segregação residencial histórica converte-se em segregação de renda atual. Em uma frase: o bairro prediz mais que o diploma. É esse eixo territorial que dá unidade às demais camadas.</w:t>
+        <w:t>Por que as dotações são desiguais? A segunda camada responde: em parte, pelo LUGAR. No modelo hierárquico, mais da metade do gap salarial é mediada pelo contexto de moradia (UPA) — um achado robusto de mediação. A raça opera, em medida relevante, ATRAVÉS do território: a segregação residencial histórica converte-se em segregação de renda atual. Ressalva metodológica: a renda média da UPA é preditor parcialmente endógeno do rendimento individual (problema do reflexo, Manski 1993), pois agrega o próprio indivíduo; por isso a interpretamos como evidência de mediação territorial, e não como 'determinante' causal isolado. É esse eixo territorial que dá unidade às demais camadas.</w:t>
       </w:r>
     </w:p>
     <w:p>
@@ -651,7 +651,7 @@
           <w:rFonts w:ascii="Times New Roman" w:hAnsi="Times New Roman"/>
           <w:sz w:val="20"/>
         </w:rPr>
-        <w:t>Figura 3. Importância SHAP (XGBoost, R²≈0,62): a renda média da UPA (bairro) é o principal determinante do rendimento, evidenciando o eixo territorial da desigualdade.</w:t>
+        <w:t>Figura 3. Importância SHAP (XGBoost, R²≈0,62): o contexto territorial (renda média da UPA) está entre os preditores de maior peso, sinalizando o eixo territorial da desigualdade — interpretado como mediação, não como determinante causal isolado.</w:t>
       </w:r>
     </w:p>
     <w:p>
@@ -674,7 +674,7 @@
           <w:i/>
           <w:sz w:val="24"/>
         </w:rPr>
-        <w:t>Camada 3 — As redes que excluem</w:t>
+        <w:t>Camada 3 — A penalidade interseccional</w:t>
       </w:r>
     </w:p>
     <w:p>
@@ -683,7 +683,7 @@
         <w:jc w:val="both"/>
       </w:pPr>
       <w:r>
-        <w:t>A terceira camada explica por que superar as duas primeiras ainda não basta. A análise de redes sociais mostra que os grupos negros — inclusive os de alta escolaridade — ocupam posições de maior isolamento estrutural (constraint de Burt) e betweenness próximo de zero: ficam fora das redes de indicação que convertem credenciais em oportunidades (Figura 4). Assim, o retorno do diploma negro é menor não por mérito, mas pela ausência do capital social que, historicamente, é majoritariamente branco (Granovetter, 1973; Burt, 2004). As três camadas — acesso, território e redes — reforçam-se mutuamente.</w:t>
+        <w:t>As duas primeiras camadas — acesso e território — combinam-se de forma agravada na interseção de raça e gênero. A decomposição interseccional mostra que a Mulher Negra acumula a maior desvantagem (gap de 96,4% vs. o Homem Branco) e, além disso, uma penalidade EXTRA de 9,5 pontos percentuais que não se reduz à soma das penalidades de raça e de gênero isoladas — a marca da interseccionalidade (Crenshaw, 1989). As camadas reforçam-se mutuamente: a barreira de acesso e o eixo territorial pesam de modo desigual sobre os diferentes grupos.</w:t>
       </w:r>
     </w:p>
     <w:p>
@@ -693,7 +693,7 @@
       <w:r>
         <w:drawing>
           <wp:inline xmlns:a="http://schemas.openxmlformats.org/drawingml/2006/main" xmlns:pic="http://schemas.openxmlformats.org/drawingml/2006/picture">
-            <wp:extent cx="4680000" cy="3202105"/>
+            <wp:extent cx="4680000" cy="3094679"/>
             <wp:docPr id="6" name="Picture 6"/>
             <wp:cNvGraphicFramePr>
               <a:graphicFrameLocks noChangeAspect="1"/>
@@ -702,11 +702,11 @@
               <a:graphicData uri="http://schemas.openxmlformats.org/drawingml/2006/picture">
                 <pic:pic>
                   <pic:nvPicPr>
-                    <pic:cNvPr id="0" name="sna_constraint_vs_renda.png"/>
+                    <pic:cNvPr id="0" name="grupo_rg_interseccional.png"/>
                     <pic:cNvPicPr/>
                   </pic:nvPicPr>
                   <pic:blipFill>
-                    <a:blip r:embed="rId14"/>
+                    <a:blip r:embed="rId11"/>
                     <a:stretch>
                       <a:fillRect/>
                     </a:stretch>
@@ -714,7 +714,7 @@
                   <pic:spPr>
                     <a:xfrm>
                       <a:off x="0" y="0"/>
-                      <a:ext cx="4680000" cy="3202105"/>
+                      <a:ext cx="4680000" cy="3094679"/>
                     </a:xfrm>
                     <a:prstGeom prst="rect"/>
                   </pic:spPr>
@@ -735,232 +735,7 @@
           <w:rFonts w:ascii="Times New Roman" w:hAnsi="Times New Roman"/>
           <w:sz w:val="20"/>
         </w:rPr>
-        <w:t>Figura 4. Análise de redes: isolamento estrutural (constraint de Burt) × renda por grupo (raça × educação) — grupos negros combinam maior isolamento e menor renda.</w:t>
-      </w:r>
-    </w:p>
-    <w:p>
-      <w:pPr>
-        <w:spacing w:before="120"/>
-      </w:pPr>
-      <w:r>
-        <w:rPr>
-          <w:rFonts w:ascii="Times New Roman" w:hAnsi="Times New Roman"/>
-          <w:b/>
-          <w:i/>
-          <w:sz w:val="24"/>
-        </w:rPr>
-        <w:t>O caráter sistêmico: heterogeneidade geográfica, Estado e gênero</w:t>
-      </w:r>
-    </w:p>
-    <w:p>
-      <w:pPr>
-        <w:ind w:firstLine="709"/>
-        <w:jc w:val="both"/>
-      </w:pPr>
-      <w:r>
-        <w:t>Três achados confirmam que se trata de um sistema, e não de fatores avulsos. Primeiro, a discriminação é GEOGRAFICAMENTE HETEROGÊNEA: modelos de inclinação aleatória (real, via lme4 e MixedLM) rejeitam o efeito homogêneo entre estados (p&lt;0,001), tanto no acesso quanto no salário — o gap salarial racial varia entre UFs de 19,7% a 2,1% (Figura 5). Segundo, o ESTADO não dissolve a barreira: o setor público atenua o gap SALARIAL racial (7,7% vs 11,1% no privado) e o homogeneíza entre UFs, mas NÃO atenua a barreira de ACESSO (OR=0,705 vs 0,698) — o concurso equaliza a remuneração de quem entra, não a entrada. Terceiro, o GÊNERO segue padrão próprio e complementar: mulheres acessam mais ocupações qualificadas (OR=1,99) mas muito menos o topo de renda (OR=0,518) — teto de vidro de remuneração, com heterogeneidade geográfica ainda maior que a racial.</w:t>
-      </w:r>
-    </w:p>
-    <w:p>
-      <w:pPr>
-        <w:jc w:val="center"/>
-      </w:pPr>
-      <w:r>
-        <w:drawing>
-          <wp:inline xmlns:a="http://schemas.openxmlformats.org/drawingml/2006/main" xmlns:pic="http://schemas.openxmlformats.org/drawingml/2006/picture">
-            <wp:extent cx="3960000" cy="3836686"/>
-            <wp:docPr id="7" name="Picture 7"/>
-            <wp:cNvGraphicFramePr>
-              <a:graphicFrameLocks noChangeAspect="1"/>
-            </wp:cNvGraphicFramePr>
-            <a:graphic>
-              <a:graphicData uri="http://schemas.openxmlformats.org/drawingml/2006/picture">
-                <pic:pic>
-                  <pic:nvPicPr>
-                    <pic:cNvPr id="0" name="mapa_po_regional.png"/>
-                    <pic:cNvPicPr/>
-                  </pic:nvPicPr>
-                  <pic:blipFill>
-                    <a:blip r:embed="rId15"/>
-                    <a:stretch>
-                      <a:fillRect/>
-                    </a:stretch>
-                  </pic:blipFill>
-                  <pic:spPr>
-                    <a:xfrm>
-                      <a:off x="0" y="0"/>
-                      <a:ext cx="3960000" cy="3836686"/>
-                    </a:xfrm>
-                    <a:prstGeom prst="rect"/>
-                  </pic:spPr>
-                </pic:pic>
-              </a:graphicData>
-            </a:graphic>
-          </wp:inline>
-        </w:drawing>
-      </w:r>
-    </w:p>
-    <w:p>
-      <w:pPr>
-        <w:spacing w:after="200"/>
-        <w:jc w:val="center"/>
-      </w:pPr>
-      <w:r>
-        <w:rPr>
-          <w:rFonts w:ascii="Times New Roman" w:hAnsi="Times New Roman"/>
-          <w:sz w:val="20"/>
-        </w:rPr>
-        <w:t>Figura 5. Penalidade salarial racial por estado (BLUP do random slope): mais escuro = maior desvantagem; estrelas marcam as UFs prioritárias para a focalização da política.</w:t>
-      </w:r>
-    </w:p>
-    <w:p>
-      <w:pPr>
-        <w:spacing w:before="120"/>
-      </w:pPr>
-      <w:r>
-        <w:rPr>
-          <w:rFonts w:ascii="Times New Roman" w:hAnsi="Times New Roman"/>
-          <w:b/>
-          <w:i/>
-          <w:sz w:val="24"/>
-        </w:rPr>
-        <w:t>Hipóteses complementares: o papel ambíguo do Estado</w:t>
-      </w:r>
-    </w:p>
-    <w:p>
-      <w:pPr>
-        <w:ind w:firstLine="709"/>
-        <w:jc w:val="both"/>
-      </w:pPr>
-      <w:r>
-        <w:t>Um conjunto de hipóteses adicionais testa diretamente a hipótese alternativa de que o Estado promoveria — ou, ao menos, não dissolveria — a desigualdade racial. Os resultados são ambíguos e refinam a tese central. Como indutor de igualdade GERAL, o Estado funciona: o setor público reduz levemente a desigualdade de renda (índice de Gini inferior ao do privado; H1). Mas como dissolvente da barreira RACIAL, não: embora o público atenue o gap racial (H2, Figura 6) — coerente com a camada sistêmica anterior —, ele PIORA o gap de gênero (−21,2% no público contra −18,9% no privado; H3): o concurso equaliza a entrada, mas a promoção às posições de liderança reflete, ou amplifica, os vieses do setor privado. No agregado (H4), o país combina pleno emprego histórico com renda real estagnada — produz ocupação, não prosperidade igualitária. E a armadilha da qualificação persiste (H5): a proporção de trabalhadores negros em ocupações de alta qualificação (≈11%) é cerca de metade da de brancos (≈22%), gap estável na década. Em síntese, o Estado mitiga a desigualdade GERAL, mas não a RACIAL — sustentando parcialmente a hipótese alternativa e reforçando o caráter sistêmico do problema.</w:t>
-      </w:r>
-    </w:p>
-    <w:p>
-      <w:pPr>
-        <w:jc w:val="center"/>
-      </w:pPr>
-      <w:r>
-        <w:drawing>
-          <wp:inline xmlns:a="http://schemas.openxmlformats.org/drawingml/2006/main" xmlns:pic="http://schemas.openxmlformats.org/drawingml/2006/picture">
-            <wp:extent cx="5400000" cy="2275595"/>
-            <wp:docPr id="8" name="Picture 8"/>
-            <wp:cNvGraphicFramePr>
-              <a:graphicFrameLocks noChangeAspect="1"/>
-            </wp:cNvGraphicFramePr>
-            <a:graphic>
-              <a:graphicData uri="http://schemas.openxmlformats.org/drawingml/2006/picture">
-                <pic:pic>
-                  <pic:nvPicPr>
-                    <pic:cNvPr id="0" name="estado_h2h3_gaps.png"/>
-                    <pic:cNvPicPr/>
-                  </pic:nvPicPr>
-                  <pic:blipFill>
-                    <a:blip r:embed="rId16"/>
-                    <a:stretch>
-                      <a:fillRect/>
-                    </a:stretch>
-                  </pic:blipFill>
-                  <pic:spPr>
-                    <a:xfrm>
-                      <a:off x="0" y="0"/>
-                      <a:ext cx="5400000" cy="2275595"/>
-                    </a:xfrm>
-                    <a:prstGeom prst="rect"/>
-                  </pic:spPr>
-                </pic:pic>
-              </a:graphicData>
-            </a:graphic>
-          </wp:inline>
-        </w:drawing>
-      </w:r>
-    </w:p>
-    <w:p>
-      <w:pPr>
-        <w:spacing w:after="200"/>
-        <w:jc w:val="center"/>
-      </w:pPr>
-      <w:r>
-        <w:rPr>
-          <w:rFonts w:ascii="Times New Roman" w:hAnsi="Times New Roman"/>
-          <w:sz w:val="20"/>
-        </w:rPr>
-        <w:t>Figura 6. Hipóteses do Estado (H2/H3): gap racial e de gênero por setor (gaps controlados) — o público atenua o racial, mas agrava o de gênero.</w:t>
-      </w:r>
-    </w:p>
-    <w:p>
-      <w:pPr>
-        <w:spacing w:before="120"/>
-      </w:pPr>
-      <w:r>
-        <w:rPr>
-          <w:rFonts w:ascii="Times New Roman" w:hAnsi="Times New Roman"/>
-          <w:b/>
-          <w:i/>
-          <w:sz w:val="24"/>
-        </w:rPr>
-        <w:t>Da diagnose à prescrição: pesquisa operacional</w:t>
-      </w:r>
-    </w:p>
-    <w:p>
-      <w:pPr>
-        <w:ind w:firstLine="709"/>
-        <w:jc w:val="both"/>
-      </w:pPr>
-      <w:r>
-        <w:t>Se a desigualdade é um sistema em camadas e territorialmente desigual, a política eficaz precisa ser multidimensional e focalizada — exatamente o que a pesquisa operacional formaliza. O ranqueamento multicritério (TOPSIS) aponta as cotas de acesso a ocupações qualificadas como intervenção dominante (CC=0,834; Figura 7), coerente com o fato de a maior barreira ser de acesso. A versão regionalizada mostra, ainda, que concentrar o orçamento nas UFs de maior penalidade (lideradas por DF, 20,8%) rende até 68% mais redução do gap do que a distribuição uniforme — fechando o ciclo entre o diagnóstico das camadas e a alocação ótima de recursos.</w:t>
-      </w:r>
-    </w:p>
-    <w:p>
-      <w:pPr>
-        <w:jc w:val="center"/>
-      </w:pPr>
-      <w:r>
-        <w:drawing>
-          <wp:inline xmlns:a="http://schemas.openxmlformats.org/drawingml/2006/main" xmlns:pic="http://schemas.openxmlformats.org/drawingml/2006/picture">
-            <wp:extent cx="5400000" cy="1768591"/>
-            <wp:docPr id="9" name="Picture 9"/>
-            <wp:cNvGraphicFramePr>
-              <a:graphicFrameLocks noChangeAspect="1"/>
-            </wp:cNvGraphicFramePr>
-            <a:graphic>
-              <a:graphicData uri="http://schemas.openxmlformats.org/drawingml/2006/picture">
-                <pic:pic>
-                  <pic:nvPicPr>
-                    <pic:cNvPr id="0" name="po_politicas_topsis.png"/>
-                    <pic:cNvPicPr/>
-                  </pic:nvPicPr>
-                  <pic:blipFill>
-                    <a:blip r:embed="rId17"/>
-                    <a:stretch>
-                      <a:fillRect/>
-                    </a:stretch>
-                  </pic:blipFill>
-                  <pic:spPr>
-                    <a:xfrm>
-                      <a:off x="0" y="0"/>
-                      <a:ext cx="5400000" cy="1768591"/>
-                    </a:xfrm>
-                    <a:prstGeom prst="rect"/>
-                  </pic:spPr>
-                </pic:pic>
-              </a:graphicData>
-            </a:graphic>
-          </wp:inline>
-        </w:drawing>
-      </w:r>
-    </w:p>
-    <w:p>
-      <w:pPr>
-        <w:spacing w:after="200"/>
-        <w:jc w:val="center"/>
-      </w:pPr>
-      <w:r>
-        <w:rPr>
-          <w:rFonts w:ascii="Times New Roman" w:hAnsi="Times New Roman"/>
-          <w:sz w:val="20"/>
-        </w:rPr>
-        <w:t>Figura 7. Pesquisa operacional (TOPSIS): ranking multicritério das seis políticas; cotas de acesso a ocupações qualificadas lideram, em linha com a barreira de acesso.</w:t>
+        <w:t>Figura 4. Decomposição interseccional (raça × gênero): gap de renda vs. o Homem Branco; a Mulher Negra acumula as duas penalidades, com um resíduo interseccional próprio.</w:t>
       </w:r>
     </w:p>
     <w:p>
@@ -1000,16 +775,7 @@
         <w:jc w:val="both"/>
       </w:pPr>
       <w:r>
-        <w:t>Granularidade da SNA. A PNAD não coleta vínculos interpessoais; a rede é de GRUPOS demográficos conectados por co-residência na UPA, não de indivíduos. Betweenness e constraint devem ser lidos como posição estrutural de grupos no espaço da segregação residencial — o andaime macroestrutural da formação de redes —, e não como intermediação interpessoal medida.</w:t>
-      </w:r>
-    </w:p>
-    <w:p>
-      <w:pPr>
-        <w:ind w:firstLine="709"/>
-        <w:jc w:val="both"/>
-      </w:pPr>
-      <w:r>
-        <w:t>Caráter normativo da PO. TOPSIS e programação linear são ferramentas prescritivas, dependentes de pesos de critério e premissas de efetividade; indicam priorização condicional a essas premissas e requerem validação empírica no contexto brasileiro.</w:t>
+        <w:t>Especificação da decomposição de Oaxaca-Blinder. A repartição entre composição e discriminação depende de quais controles se tratam como dotações. Adota-se a especificação de acesso (ocupação e contexto como dotações; 83,8% de composição), coerente com a leitura de que a discriminação age sobretudo no acesso às ocupações — medido diretamente pelo GLMM. Como alerta Oaxaca e Ransom (1999), tratar a ocupação como dotação tende a subestimar a discriminação total, já que a segregação ocupacional é, ela própria, discriminatória; daí a complementaridade entre os métodos.</w:t>
       </w:r>
     </w:p>
     <w:p>
@@ -1031,7 +797,7 @@
         <w:jc w:val="both"/>
       </w:pPr>
       <w:r>
-        <w:t>Tomados em conjunto, os resultados parciais convergem para a tese central: a desigualdade racial no trabalho brasileiro é um SISTEMA DE BARREIRAS EM CAMADAS — acesso, remuneração e redes — que se reforçam e têm como eixo comum o TERRITÓRIO (o bairro prediz mais que o diploma). Esse sistema persiste sob controle de escolaridade, agrava-se no topo da distribuição, varia entre estados e não é dissolvido pelo Estado, que equaliza a remuneração de quem entra, mas não o acesso. A consequência prescritiva é direta: políticas unidimensionais e uniformes são insuficientes; a pesquisa operacional indica intervenção multidimensional, centrada no acesso e focalizada nas UFs de maior penalidade. As próximas etapas incluem o refinamento das análises de robustez e a consolidação das recomendações.</w:t>
+        <w:t>Tomados em conjunto, os resultados parciais convergem para a tese central: a desigualdade racial no trabalho brasileiro é um SISTEMA DE BARREIRAS EM CAMADAS — acesso, remuneração e interseccionalidade — com forte mediação do TERRITÓRIO (o contexto de moradia responde por mais da metade do gap). O gap é majoritariamente composição (Oaxaca: 83,8%), mas a composição é produto da discriminação no acesso às ocupações (GLMM: OR≈0,705) e convive com discriminação salarial residual, maior na base da distribuição (sticky floor). A consequência prescritiva é direta: políticas unidimensionais são insuficientes; a intervenção deve ser multidimensional e centrada no acesso a ocupações qualificadas. As próximas etapas incluem o refinamento das análises de robustez e a consolidação das recomendações.</w:t>
       </w:r>
     </w:p>
     <w:p>
@@ -1080,18 +846,6 @@
         <w:rPr>
           <w:sz w:val="22"/>
         </w:rPr>
-        <w:t>BURT, R. S. Structural holes and good ideas. American Journal of Sociology, v. 110, n. 2, p. 349-399, 2004.</w:t>
-      </w:r>
-    </w:p>
-    <w:p>
-      <w:pPr>
-        <w:spacing w:after="120" w:line="240" w:lineRule="auto"/>
-        <w:jc w:val="both"/>
-      </w:pPr>
-      <w:r>
-        <w:rPr>
-          <w:sz w:val="22"/>
-        </w:rPr>
         <w:t>CHEN, T.; GUESTRIN, C. XGBoost: a scalable tree boosting system. In: KDD, 2016. p. 785-794.</w:t>
       </w:r>
     </w:p>
@@ -1104,7 +858,19 @@
         <w:rPr>
           <w:sz w:val="22"/>
         </w:rPr>
-        <w:t>GRANOVETTER, M. The strength of weak ties. American Journal of Sociology, v. 78, n. 6, p. 1360-1380, 1973.</w:t>
+        <w:t>CRENSHAW, K. Demarginalizing the intersection of race and sex. University of Chicago Legal Forum, v. 1989, n. 1, p. 139-167, 1989.</w:t>
+      </w:r>
+    </w:p>
+    <w:p>
+      <w:pPr>
+        <w:spacing w:after="120" w:line="240" w:lineRule="auto"/>
+        <w:jc w:val="both"/>
+      </w:pPr>
+      <w:r>
+        <w:rPr>
+          <w:sz w:val="22"/>
+        </w:rPr>
+        <w:t>FIRPO, S.; FORTIN, N. M.; LEMIEUX, T. Decomposing wage distributions using recentered influence function regressions. Econometrics, v. 6, n. 2, p. 28, 2018.</w:t>
       </w:r>
     </w:p>
     <w:p>
@@ -1129,18 +895,6 @@
           <w:sz w:val="22"/>
         </w:rPr>
         <w:t>HENRIQUES, R. Desigualdade racial no Brasil: evolução das condições de vida na década de 90. Rio de Janeiro: IPEA, 2001. (Texto para discussão, 807).</w:t>
-      </w:r>
-    </w:p>
-    <w:p>
-      <w:pPr>
-        <w:spacing w:after="120" w:line="240" w:lineRule="auto"/>
-        <w:jc w:val="both"/>
-      </w:pPr>
-      <w:r>
-        <w:rPr>
-          <w:sz w:val="22"/>
-        </w:rPr>
-        <w:t>HWANG, C. L.; YOON, K. Multiple attribute decision making: methods and applications. Berlin: Springer, 1981.</w:t>
       </w:r>
     </w:p>
     <w:p>
@@ -1212,6 +966,18 @@
         <w:rPr>
           <w:sz w:val="22"/>
         </w:rPr>
+        <w:t>OAXACA, R. L.; RANSOM, M. R. Identification in detailed wage decompositions. Review of Economics and Statistics, v. 81, n. 1, p. 154-157, 1999.</w:t>
+      </w:r>
+    </w:p>
+    <w:p>
+      <w:pPr>
+        <w:spacing w:after="120" w:line="240" w:lineRule="auto"/>
+        <w:jc w:val="both"/>
+      </w:pPr>
+      <w:r>
+        <w:rPr>
+          <w:sz w:val="22"/>
+        </w:rPr>
         <w:t>OAXACA, R. Male-female wage differentials in urban labor markets. International Economic Review, v. 14, n. 3, p. 693-709, 1973.</w:t>
       </w:r>
     </w:p>
@@ -1248,18 +1014,6 @@
         <w:rPr>
           <w:sz w:val="22"/>
         </w:rPr>
-        <w:t>SAATY, T. L. The analytic hierarchy process. New York: McGraw-Hill, 1980.</w:t>
-      </w:r>
-    </w:p>
-    <w:p>
-      <w:pPr>
-        <w:spacing w:after="120" w:line="240" w:lineRule="auto"/>
-        <w:jc w:val="both"/>
-      </w:pPr>
-      <w:r>
-        <w:rPr>
-          <w:sz w:val="22"/>
-        </w:rPr>
         <w:t>SAMPSON, R. J.; RAUDENBUSH, S. W.; EARLS, F. Neighborhoods and violent crime. Science, v. 277, p. 918-924, 1997.</w:t>
       </w:r>
     </w:p>
@@ -1284,7 +1038,7 @@
         <w:rPr>
           <w:sz w:val="22"/>
         </w:rPr>
-        <w:t>STRAM, D. O.; LEE, J. W. Variance components testing in the longitudinal mixed effects model. Biometrics, v. 50, n. 4, p. 1171-1177, 1994.</w:t>
+        <w:t>VANDERWEELE, T. J.; DING, P. Sensitivity analysis in observational research: introducing the E-value. Annals of Internal Medicine, v. 167, n. 4, p. 268-274, 2017.</w:t>
       </w:r>
     </w:p>
     <w:p>

</xml_diff>

<commit_message>
feat(tcc): adiciona tabelas de resultado ao Resultados Preliminares (orientador)
O orientador pediu resultados em tabelas, além das figuras; o gerar_resultados_
preliminares.py tinha 0 tabelas (só 8 figuras). Adiciona helper tabela() (docx,
grade ABNT) e 4 tabelas de resultado lidas dos CSV canônicos:
  T1 GLMM teto de vidro (OR/AME/E-value por desfecho, M2 pop. completa)
  T2 Mediação HLM M1->M4 (gap -19,1%->-6,2%, mediação 69,8%)
  T3 Oaxaca de acesso (dotações 83,8% / discriminação 16,2%)
  T4 Interseccional (Mulher Negra gap 96,4%, penal. extra 9,5pp)
Validado: docx abre, 4 tabelas com números corretos.

Regenera os demais entregáveis (relatório Word 16 tabelas; apresentações e guia
inalterados em conteúdo). Todos abrem como OOXML válido.

Co-Authored-By: Claude Opus 4.8 <noreply@anthropic.com>
</commit_message>
<xml_diff>
--- a/entregaveis/Resultados_Preliminares_TCC.docx
+++ b/entregaveis/Resultados_Preliminares_TCC.docx
@@ -304,7 +304,7 @@
         <w:jc w:val="both"/>
       </w:pPr>
       <w:r>
-        <w:t>Os resultados preliminares sustentam uma tese central: a desigualdade racial no mercado de trabalho brasileiro não é um evento pontual de contratação, mas um SISTEMA DE BARREIRAS EM CAMADAS — acesso, remuneração e redes — ancorado no território e geograficamente heterogêneo, que persiste mesmo quando se controla a escolaridade e mesmo dentro do Estado. As subseções a seguir percorrem esse sistema: partem da falha da explicação meritocrática, isolam as três camadas que a substituem, demonstram seu caráter sistêmico e, por fim, traduzem o diagnóstico em prescrição.</w:t>
+        <w:t>Os resultados preliminares sustentam uma tese central: a desigualdade racial no mercado de trabalho brasileiro não é um evento pontual de contratação, mas um SISTEMA DE BARREIRAS EM CAMADAS — acesso, remuneração e interseccionalidade — com forte mediação do território, que persiste mesmo quando se controla a escolaridade. As subseções a seguir percorrem esse sistema: partem da falha da explicação meritocrática e isolam as três camadas que a substituem.</w:t>
       </w:r>
     </w:p>
     <w:p>
@@ -456,6 +456,335 @@
         </w:rPr>
         <w:t>Figura 2. GLMM — odds ratios de acesso por desfecho: o gradiente decrescente rumo ao topo da renda caracteriza o teto de vidro de acesso (OR &lt; 1 = barreira).</w:t>
       </w:r>
+    </w:p>
+    <w:p>
+      <w:pPr>
+        <w:spacing w:before="160"/>
+        <w:jc w:val="center"/>
+      </w:pPr>
+      <w:r>
+        <w:rPr>
+          <w:rFonts w:ascii="Times New Roman" w:hAnsi="Times New Roman"/>
+          <w:b/>
+          <w:sz w:val="20"/>
+        </w:rPr>
+        <w:t>Tabela 1. GLMM logístico (M2, população completa) — teto de vidro de acesso. OR &lt; 1 = menor chance de acesso para negros vs. brancos de mesmo perfil; AME em pontos percentuais; E-value ≥ 2 indica robustez a confundidor não observado.</w:t>
+      </w:r>
+    </w:p>
+    <w:tbl>
+      <w:tblPr>
+        <w:tblStyle w:val="TableGrid"/>
+        <w:tblW w:type="auto" w:w="0"/>
+        <w:jc w:val="center"/>
+        <w:tblLook w:firstColumn="1" w:firstRow="1" w:lastColumn="0" w:lastRow="0" w:noHBand="0" w:noVBand="1" w:val="04A0"/>
+      </w:tblPr>
+      <w:tblGrid>
+        <w:gridCol w:w="2351"/>
+        <w:gridCol w:w="2351"/>
+        <w:gridCol w:w="2351"/>
+        <w:gridCol w:w="2351"/>
+      </w:tblGrid>
+      <w:tr>
+        <w:tc>
+          <w:tcPr>
+            <w:tcW w:type="dxa" w:w="2351"/>
+          </w:tcPr>
+          <w:p>
+            <w:pPr>
+              <w:jc w:val="center"/>
+            </w:pPr>
+            <w:r>
+              <w:rPr>
+                <w:rFonts w:ascii="Times New Roman" w:hAnsi="Times New Roman"/>
+                <w:b/>
+                <w:sz w:val="20"/>
+              </w:rPr>
+              <w:t>Desfecho</w:t>
+            </w:r>
+          </w:p>
+        </w:tc>
+        <w:tc>
+          <w:tcPr>
+            <w:tcW w:type="dxa" w:w="2351"/>
+          </w:tcPr>
+          <w:p>
+            <w:pPr>
+              <w:jc w:val="center"/>
+            </w:pPr>
+            <w:r>
+              <w:rPr>
+                <w:rFonts w:ascii="Times New Roman" w:hAnsi="Times New Roman"/>
+                <w:b/>
+                <w:sz w:val="20"/>
+              </w:rPr>
+              <w:t>OR (negro)</w:t>
+            </w:r>
+          </w:p>
+        </w:tc>
+        <w:tc>
+          <w:tcPr>
+            <w:tcW w:type="dxa" w:w="2351"/>
+          </w:tcPr>
+          <w:p>
+            <w:pPr>
+              <w:jc w:val="center"/>
+            </w:pPr>
+            <w:r>
+              <w:rPr>
+                <w:rFonts w:ascii="Times New Roman" w:hAnsi="Times New Roman"/>
+                <w:b/>
+                <w:sz w:val="20"/>
+              </w:rPr>
+              <w:t>AME (p.p.)</w:t>
+            </w:r>
+          </w:p>
+        </w:tc>
+        <w:tc>
+          <w:tcPr>
+            <w:tcW w:type="dxa" w:w="2351"/>
+          </w:tcPr>
+          <w:p>
+            <w:pPr>
+              <w:jc w:val="center"/>
+            </w:pPr>
+            <w:r>
+              <w:rPr>
+                <w:rFonts w:ascii="Times New Roman" w:hAnsi="Times New Roman"/>
+                <w:b/>
+                <w:sz w:val="20"/>
+              </w:rPr>
+              <w:t>E-value</w:t>
+            </w:r>
+          </w:p>
+        </w:tc>
+      </w:tr>
+      <w:tr>
+        <w:tc>
+          <w:tcPr>
+            <w:tcW w:type="dxa" w:w="2351"/>
+          </w:tcPr>
+          <w:p>
+            <w:pPr>
+              <w:jc w:val="center"/>
+            </w:pPr>
+            <w:r>
+              <w:rPr>
+                <w:rFonts w:ascii="Times New Roman" w:hAnsi="Times New Roman"/>
+                <w:b w:val="0"/>
+                <w:sz w:val="20"/>
+              </w:rPr>
+              <w:t>Cargo qualificado (CBO 1–4)</w:t>
+            </w:r>
+          </w:p>
+        </w:tc>
+        <w:tc>
+          <w:tcPr>
+            <w:tcW w:type="dxa" w:w="2351"/>
+          </w:tcPr>
+          <w:p>
+            <w:pPr>
+              <w:jc w:val="center"/>
+            </w:pPr>
+            <w:r>
+              <w:rPr>
+                <w:rFonts w:ascii="Times New Roman" w:hAnsi="Times New Roman"/>
+                <w:b w:val="0"/>
+                <w:sz w:val="20"/>
+              </w:rPr>
+              <w:t>0,705</w:t>
+            </w:r>
+          </w:p>
+        </w:tc>
+        <w:tc>
+          <w:tcPr>
+            <w:tcW w:type="dxa" w:w="2351"/>
+          </w:tcPr>
+          <w:p>
+            <w:pPr>
+              <w:jc w:val="center"/>
+            </w:pPr>
+            <w:r>
+              <w:rPr>
+                <w:rFonts w:ascii="Times New Roman" w:hAnsi="Times New Roman"/>
+                <w:b w:val="0"/>
+                <w:sz w:val="20"/>
+              </w:rPr>
+              <w:t>−4,7</w:t>
+            </w:r>
+          </w:p>
+        </w:tc>
+        <w:tc>
+          <w:tcPr>
+            <w:tcW w:type="dxa" w:w="2351"/>
+          </w:tcPr>
+          <w:p>
+            <w:pPr>
+              <w:jc w:val="center"/>
+            </w:pPr>
+            <w:r>
+              <w:rPr>
+                <w:rFonts w:ascii="Times New Roman" w:hAnsi="Times New Roman"/>
+                <w:b w:val="0"/>
+                <w:sz w:val="20"/>
+              </w:rPr>
+              <w:t>2,20</w:t>
+            </w:r>
+          </w:p>
+        </w:tc>
+      </w:tr>
+      <w:tr>
+        <w:tc>
+          <w:tcPr>
+            <w:tcW w:type="dxa" w:w="2351"/>
+          </w:tcPr>
+          <w:p>
+            <w:pPr>
+              <w:jc w:val="center"/>
+            </w:pPr>
+            <w:r>
+              <w:rPr>
+                <w:rFonts w:ascii="Times New Roman" w:hAnsi="Times New Roman"/>
+                <w:b w:val="0"/>
+                <w:sz w:val="20"/>
+              </w:rPr>
+              <w:t>Top 20% de renda</w:t>
+            </w:r>
+          </w:p>
+        </w:tc>
+        <w:tc>
+          <w:tcPr>
+            <w:tcW w:type="dxa" w:w="2351"/>
+          </w:tcPr>
+          <w:p>
+            <w:pPr>
+              <w:jc w:val="center"/>
+            </w:pPr>
+            <w:r>
+              <w:rPr>
+                <w:rFonts w:ascii="Times New Roman" w:hAnsi="Times New Roman"/>
+                <w:b w:val="0"/>
+                <w:sz w:val="20"/>
+              </w:rPr>
+              <w:t>0,691</w:t>
+            </w:r>
+          </w:p>
+        </w:tc>
+        <w:tc>
+          <w:tcPr>
+            <w:tcW w:type="dxa" w:w="2351"/>
+          </w:tcPr>
+          <w:p>
+            <w:pPr>
+              <w:jc w:val="center"/>
+            </w:pPr>
+            <w:r>
+              <w:rPr>
+                <w:rFonts w:ascii="Times New Roman" w:hAnsi="Times New Roman"/>
+                <w:b w:val="0"/>
+                <w:sz w:val="20"/>
+              </w:rPr>
+              <w:t>−4,6</w:t>
+            </w:r>
+          </w:p>
+        </w:tc>
+        <w:tc>
+          <w:tcPr>
+            <w:tcW w:type="dxa" w:w="2351"/>
+          </w:tcPr>
+          <w:p>
+            <w:pPr>
+              <w:jc w:val="center"/>
+            </w:pPr>
+            <w:r>
+              <w:rPr>
+                <w:rFonts w:ascii="Times New Roman" w:hAnsi="Times New Roman"/>
+                <w:b w:val="0"/>
+                <w:sz w:val="20"/>
+              </w:rPr>
+              <w:t>2,26</w:t>
+            </w:r>
+          </w:p>
+        </w:tc>
+      </w:tr>
+      <w:tr>
+        <w:tc>
+          <w:tcPr>
+            <w:tcW w:type="dxa" w:w="2351"/>
+          </w:tcPr>
+          <w:p>
+            <w:pPr>
+              <w:jc w:val="center"/>
+            </w:pPr>
+            <w:r>
+              <w:rPr>
+                <w:rFonts w:ascii="Times New Roman" w:hAnsi="Times New Roman"/>
+                <w:b w:val="0"/>
+                <w:sz w:val="20"/>
+              </w:rPr>
+              <w:t>Top 10% de renda</w:t>
+            </w:r>
+          </w:p>
+        </w:tc>
+        <w:tc>
+          <w:tcPr>
+            <w:tcW w:type="dxa" w:w="2351"/>
+          </w:tcPr>
+          <w:p>
+            <w:pPr>
+              <w:jc w:val="center"/>
+            </w:pPr>
+            <w:r>
+              <w:rPr>
+                <w:rFonts w:ascii="Times New Roman" w:hAnsi="Times New Roman"/>
+                <w:b w:val="0"/>
+                <w:sz w:val="20"/>
+              </w:rPr>
+              <w:t>0,656</w:t>
+            </w:r>
+          </w:p>
+        </w:tc>
+        <w:tc>
+          <w:tcPr>
+            <w:tcW w:type="dxa" w:w="2351"/>
+          </w:tcPr>
+          <w:p>
+            <w:pPr>
+              <w:jc w:val="center"/>
+            </w:pPr>
+            <w:r>
+              <w:rPr>
+                <w:rFonts w:ascii="Times New Roman" w:hAnsi="Times New Roman"/>
+                <w:b w:val="0"/>
+                <w:sz w:val="20"/>
+              </w:rPr>
+              <w:t>−2,9</w:t>
+            </w:r>
+          </w:p>
+        </w:tc>
+        <w:tc>
+          <w:tcPr>
+            <w:tcW w:type="dxa" w:w="2351"/>
+          </w:tcPr>
+          <w:p>
+            <w:pPr>
+              <w:jc w:val="center"/>
+            </w:pPr>
+            <w:r>
+              <w:rPr>
+                <w:rFonts w:ascii="Times New Roman" w:hAnsi="Times New Roman"/>
+                <w:b w:val="0"/>
+                <w:sz w:val="20"/>
+              </w:rPr>
+              <w:t>2,43</w:t>
+            </w:r>
+          </w:p>
+        </w:tc>
+      </w:tr>
+    </w:tbl>
+    <w:p>
+      <w:pPr>
+        <w:spacing w:after="160"/>
+      </w:pPr>
     </w:p>
     <w:p>
       <w:pPr>
@@ -665,6 +994,554 @@
     </w:p>
     <w:p>
       <w:pPr>
+        <w:spacing w:before="160"/>
+        <w:jc w:val="center"/>
+      </w:pPr>
+      <w:r>
+        <w:rPr>
+          <w:rFonts w:ascii="Times New Roman" w:hAnsi="Times New Roman"/>
+          <w:b/>
+          <w:sz w:val="20"/>
+        </w:rPr>
+        <w:t>Tabela 2. Decomposição do gap por mediação (HLM de três níveis, PNAD Contínua 2016–2025). Cada modelo acrescenta controles ao anterior; o gap encolhe de −19,1% (M1) para −6,2% (M4), com 69,8% mediado por contexto de moradia e ocupação.</w:t>
+      </w:r>
+    </w:p>
+    <w:tbl>
+      <w:tblPr>
+        <w:tblStyle w:val="TableGrid"/>
+        <w:tblW w:type="auto" w:w="0"/>
+        <w:jc w:val="center"/>
+        <w:tblLook w:firstColumn="1" w:firstRow="1" w:lastColumn="0" w:lastRow="0" w:noHBand="0" w:noVBand="1" w:val="04A0"/>
+      </w:tblPr>
+      <w:tblGrid>
+        <w:gridCol w:w="2351"/>
+        <w:gridCol w:w="2351"/>
+        <w:gridCol w:w="2351"/>
+        <w:gridCol w:w="2351"/>
+      </w:tblGrid>
+      <w:tr>
+        <w:tc>
+          <w:tcPr>
+            <w:tcW w:type="dxa" w:w="2351"/>
+          </w:tcPr>
+          <w:p>
+            <w:pPr>
+              <w:jc w:val="center"/>
+            </w:pPr>
+            <w:r>
+              <w:rPr>
+                <w:rFonts w:ascii="Times New Roman" w:hAnsi="Times New Roman"/>
+                <w:b/>
+                <w:sz w:val="20"/>
+              </w:rPr>
+              <w:t>Modelo (controles acumulados)</w:t>
+            </w:r>
+          </w:p>
+        </w:tc>
+        <w:tc>
+          <w:tcPr>
+            <w:tcW w:type="dxa" w:w="2351"/>
+          </w:tcPr>
+          <w:p>
+            <w:pPr>
+              <w:jc w:val="center"/>
+            </w:pPr>
+            <w:r>
+              <w:rPr>
+                <w:rFonts w:ascii="Times New Roman" w:hAnsi="Times New Roman"/>
+                <w:b/>
+                <w:sz w:val="20"/>
+              </w:rPr>
+              <w:t>β negro</w:t>
+            </w:r>
+          </w:p>
+        </w:tc>
+        <w:tc>
+          <w:tcPr>
+            <w:tcW w:type="dxa" w:w="2351"/>
+          </w:tcPr>
+          <w:p>
+            <w:pPr>
+              <w:jc w:val="center"/>
+            </w:pPr>
+            <w:r>
+              <w:rPr>
+                <w:rFonts w:ascii="Times New Roman" w:hAnsi="Times New Roman"/>
+                <w:b/>
+                <w:sz w:val="20"/>
+              </w:rPr>
+              <w:t>Gap (%)</w:t>
+            </w:r>
+          </w:p>
+        </w:tc>
+        <w:tc>
+          <w:tcPr>
+            <w:tcW w:type="dxa" w:w="2351"/>
+          </w:tcPr>
+          <w:p>
+            <w:pPr>
+              <w:jc w:val="center"/>
+            </w:pPr>
+            <w:r>
+              <w:rPr>
+                <w:rFonts w:ascii="Times New Roman" w:hAnsi="Times New Roman"/>
+                <w:b/>
+                <w:sz w:val="20"/>
+              </w:rPr>
+              <w:t>Mediação acum. (%)</w:t>
+            </w:r>
+          </w:p>
+        </w:tc>
+      </w:tr>
+      <w:tr>
+        <w:tc>
+          <w:tcPr>
+            <w:tcW w:type="dxa" w:w="2351"/>
+          </w:tcPr>
+          <w:p>
+            <w:pPr>
+              <w:jc w:val="center"/>
+            </w:pPr>
+            <w:r>
+              <w:rPr>
+                <w:rFonts w:ascii="Times New Roman" w:hAnsi="Times New Roman"/>
+                <w:b w:val="0"/>
+                <w:sz w:val="20"/>
+              </w:rPr>
+              <w:t>M1 (individual)</w:t>
+            </w:r>
+          </w:p>
+        </w:tc>
+        <w:tc>
+          <w:tcPr>
+            <w:tcW w:type="dxa" w:w="2351"/>
+          </w:tcPr>
+          <w:p>
+            <w:pPr>
+              <w:jc w:val="center"/>
+            </w:pPr>
+            <w:r>
+              <w:rPr>
+                <w:rFonts w:ascii="Times New Roman" w:hAnsi="Times New Roman"/>
+                <w:b w:val="0"/>
+                <w:sz w:val="20"/>
+              </w:rPr>
+              <w:t>−0,2123</w:t>
+            </w:r>
+          </w:p>
+        </w:tc>
+        <w:tc>
+          <w:tcPr>
+            <w:tcW w:type="dxa" w:w="2351"/>
+          </w:tcPr>
+          <w:p>
+            <w:pPr>
+              <w:jc w:val="center"/>
+            </w:pPr>
+            <w:r>
+              <w:rPr>
+                <w:rFonts w:ascii="Times New Roman" w:hAnsi="Times New Roman"/>
+                <w:b w:val="0"/>
+                <w:sz w:val="20"/>
+              </w:rPr>
+              <w:t>−19,1</w:t>
+            </w:r>
+          </w:p>
+        </w:tc>
+        <w:tc>
+          <w:tcPr>
+            <w:tcW w:type="dxa" w:w="2351"/>
+          </w:tcPr>
+          <w:p>
+            <w:pPr>
+              <w:jc w:val="center"/>
+            </w:pPr>
+            <w:r>
+              <w:rPr>
+                <w:rFonts w:ascii="Times New Roman" w:hAnsi="Times New Roman"/>
+                <w:b w:val="0"/>
+                <w:sz w:val="20"/>
+              </w:rPr>
+              <w:t>—</w:t>
+            </w:r>
+          </w:p>
+        </w:tc>
+      </w:tr>
+      <w:tr>
+        <w:tc>
+          <w:tcPr>
+            <w:tcW w:type="dxa" w:w="2351"/>
+          </w:tcPr>
+          <w:p>
+            <w:pPr>
+              <w:jc w:val="center"/>
+            </w:pPr>
+            <w:r>
+              <w:rPr>
+                <w:rFonts w:ascii="Times New Roman" w:hAnsi="Times New Roman"/>
+                <w:b w:val="0"/>
+                <w:sz w:val="20"/>
+              </w:rPr>
+              <w:t>M2 (+ contexto UPA)</w:t>
+            </w:r>
+          </w:p>
+        </w:tc>
+        <w:tc>
+          <w:tcPr>
+            <w:tcW w:type="dxa" w:w="2351"/>
+          </w:tcPr>
+          <w:p>
+            <w:pPr>
+              <w:jc w:val="center"/>
+            </w:pPr>
+            <w:r>
+              <w:rPr>
+                <w:rFonts w:ascii="Times New Roman" w:hAnsi="Times New Roman"/>
+                <w:b w:val="0"/>
+                <w:sz w:val="20"/>
+              </w:rPr>
+              <w:t>−0,1009</w:t>
+            </w:r>
+          </w:p>
+        </w:tc>
+        <w:tc>
+          <w:tcPr>
+            <w:tcW w:type="dxa" w:w="2351"/>
+          </w:tcPr>
+          <w:p>
+            <w:pPr>
+              <w:jc w:val="center"/>
+            </w:pPr>
+            <w:r>
+              <w:rPr>
+                <w:rFonts w:ascii="Times New Roman" w:hAnsi="Times New Roman"/>
+                <w:b w:val="0"/>
+                <w:sz w:val="20"/>
+              </w:rPr>
+              <w:t>−9,6</w:t>
+            </w:r>
+          </w:p>
+        </w:tc>
+        <w:tc>
+          <w:tcPr>
+            <w:tcW w:type="dxa" w:w="2351"/>
+          </w:tcPr>
+          <w:p>
+            <w:pPr>
+              <w:jc w:val="center"/>
+            </w:pPr>
+            <w:r>
+              <w:rPr>
+                <w:rFonts w:ascii="Times New Roman" w:hAnsi="Times New Roman"/>
+                <w:b w:val="0"/>
+                <w:sz w:val="20"/>
+              </w:rPr>
+              <w:t>52,5</w:t>
+            </w:r>
+          </w:p>
+        </w:tc>
+      </w:tr>
+      <w:tr>
+        <w:tc>
+          <w:tcPr>
+            <w:tcW w:type="dxa" w:w="2351"/>
+          </w:tcPr>
+          <w:p>
+            <w:pPr>
+              <w:jc w:val="center"/>
+            </w:pPr>
+            <w:r>
+              <w:rPr>
+                <w:rFonts w:ascii="Times New Roman" w:hAnsi="Times New Roman"/>
+                <w:b w:val="0"/>
+                <w:sz w:val="20"/>
+              </w:rPr>
+              <w:t>M3 (+ UF)</w:t>
+            </w:r>
+          </w:p>
+        </w:tc>
+        <w:tc>
+          <w:tcPr>
+            <w:tcW w:type="dxa" w:w="2351"/>
+          </w:tcPr>
+          <w:p>
+            <w:pPr>
+              <w:jc w:val="center"/>
+            </w:pPr>
+            <w:r>
+              <w:rPr>
+                <w:rFonts w:ascii="Times New Roman" w:hAnsi="Times New Roman"/>
+                <w:b w:val="0"/>
+                <w:sz w:val="20"/>
+              </w:rPr>
+              <w:t>−0,1009</w:t>
+            </w:r>
+          </w:p>
+        </w:tc>
+        <w:tc>
+          <w:tcPr>
+            <w:tcW w:type="dxa" w:w="2351"/>
+          </w:tcPr>
+          <w:p>
+            <w:pPr>
+              <w:jc w:val="center"/>
+            </w:pPr>
+            <w:r>
+              <w:rPr>
+                <w:rFonts w:ascii="Times New Roman" w:hAnsi="Times New Roman"/>
+                <w:b w:val="0"/>
+                <w:sz w:val="20"/>
+              </w:rPr>
+              <w:t>−9,6</w:t>
+            </w:r>
+          </w:p>
+        </w:tc>
+        <w:tc>
+          <w:tcPr>
+            <w:tcW w:type="dxa" w:w="2351"/>
+          </w:tcPr>
+          <w:p>
+            <w:pPr>
+              <w:jc w:val="center"/>
+            </w:pPr>
+            <w:r>
+              <w:rPr>
+                <w:rFonts w:ascii="Times New Roman" w:hAnsi="Times New Roman"/>
+                <w:b w:val="0"/>
+                <w:sz w:val="20"/>
+              </w:rPr>
+              <w:t>52,5</w:t>
+            </w:r>
+          </w:p>
+        </w:tc>
+      </w:tr>
+      <w:tr>
+        <w:tc>
+          <w:tcPr>
+            <w:tcW w:type="dxa" w:w="2351"/>
+          </w:tcPr>
+          <w:p>
+            <w:pPr>
+              <w:jc w:val="center"/>
+            </w:pPr>
+            <w:r>
+              <w:rPr>
+                <w:rFonts w:ascii="Times New Roman" w:hAnsi="Times New Roman"/>
+                <w:b w:val="0"/>
+                <w:sz w:val="20"/>
+              </w:rPr>
+              <w:t>M4 (+ ocupação)</w:t>
+            </w:r>
+          </w:p>
+        </w:tc>
+        <w:tc>
+          <w:tcPr>
+            <w:tcW w:type="dxa" w:w="2351"/>
+          </w:tcPr>
+          <w:p>
+            <w:pPr>
+              <w:jc w:val="center"/>
+            </w:pPr>
+            <w:r>
+              <w:rPr>
+                <w:rFonts w:ascii="Times New Roman" w:hAnsi="Times New Roman"/>
+                <w:b w:val="0"/>
+                <w:sz w:val="20"/>
+              </w:rPr>
+              <w:t>−0,0641</w:t>
+            </w:r>
+          </w:p>
+        </w:tc>
+        <w:tc>
+          <w:tcPr>
+            <w:tcW w:type="dxa" w:w="2351"/>
+          </w:tcPr>
+          <w:p>
+            <w:pPr>
+              <w:jc w:val="center"/>
+            </w:pPr>
+            <w:r>
+              <w:rPr>
+                <w:rFonts w:ascii="Times New Roman" w:hAnsi="Times New Roman"/>
+                <w:b w:val="0"/>
+                <w:sz w:val="20"/>
+              </w:rPr>
+              <w:t>−6,2</w:t>
+            </w:r>
+          </w:p>
+        </w:tc>
+        <w:tc>
+          <w:tcPr>
+            <w:tcW w:type="dxa" w:w="2351"/>
+          </w:tcPr>
+          <w:p>
+            <w:pPr>
+              <w:jc w:val="center"/>
+            </w:pPr>
+            <w:r>
+              <w:rPr>
+                <w:rFonts w:ascii="Times New Roman" w:hAnsi="Times New Roman"/>
+                <w:b w:val="0"/>
+                <w:sz w:val="20"/>
+              </w:rPr>
+              <w:t>69,8</w:t>
+            </w:r>
+          </w:p>
+        </w:tc>
+      </w:tr>
+    </w:tbl>
+    <w:p>
+      <w:pPr>
+        <w:spacing w:after="160"/>
+      </w:pPr>
+    </w:p>
+    <w:p>
+      <w:pPr>
+        <w:spacing w:before="160"/>
+        <w:jc w:val="center"/>
+      </w:pPr>
+      <w:r>
+        <w:rPr>
+          <w:rFonts w:ascii="Times New Roman" w:hAnsi="Times New Roman"/>
+          <w:b/>
+          <w:sz w:val="20"/>
+        </w:rPr>
+        <w:t>Tabela 3. Decomposição de Oaxaca-Blinder (especificação de acesso, com ocupação e contexto como dotações; população completa). Dotações + Coeficiente = 100% do gap. Ressalva (Oaxaca &amp; Ransom, 1999): incluir ocupação como dotação subestima a discriminação — daí a complementaridade com o GLMM de acesso (Tabela 1).</w:t>
+      </w:r>
+    </w:p>
+    <w:tbl>
+      <w:tblPr>
+        <w:tblStyle w:val="TableGrid"/>
+        <w:tblW w:type="auto" w:w="0"/>
+        <w:jc w:val="center"/>
+        <w:tblLook w:firstColumn="1" w:firstRow="1" w:lastColumn="0" w:lastRow="0" w:noHBand="0" w:noVBand="1" w:val="04A0"/>
+      </w:tblPr>
+      <w:tblGrid>
+        <w:gridCol w:w="4702"/>
+        <w:gridCol w:w="4702"/>
+      </w:tblGrid>
+      <w:tr>
+        <w:tc>
+          <w:tcPr>
+            <w:tcW w:type="dxa" w:w="4702"/>
+          </w:tcPr>
+          <w:p>
+            <w:pPr>
+              <w:jc w:val="center"/>
+            </w:pPr>
+            <w:r>
+              <w:rPr>
+                <w:rFonts w:ascii="Times New Roman" w:hAnsi="Times New Roman"/>
+                <w:b/>
+                <w:sz w:val="20"/>
+              </w:rPr>
+              <w:t>Componente</w:t>
+            </w:r>
+          </w:p>
+        </w:tc>
+        <w:tc>
+          <w:tcPr>
+            <w:tcW w:type="dxa" w:w="4702"/>
+          </w:tcPr>
+          <w:p>
+            <w:pPr>
+              <w:jc w:val="center"/>
+            </w:pPr>
+            <w:r>
+              <w:rPr>
+                <w:rFonts w:ascii="Times New Roman" w:hAnsi="Times New Roman"/>
+                <w:b/>
+                <w:sz w:val="20"/>
+              </w:rPr>
+              <w:t>% do Gap</w:t>
+            </w:r>
+          </w:p>
+        </w:tc>
+      </w:tr>
+      <w:tr>
+        <w:tc>
+          <w:tcPr>
+            <w:tcW w:type="dxa" w:w="4702"/>
+          </w:tcPr>
+          <w:p>
+            <w:pPr>
+              <w:jc w:val="center"/>
+            </w:pPr>
+            <w:r>
+              <w:rPr>
+                <w:rFonts w:ascii="Times New Roman" w:hAnsi="Times New Roman"/>
+                <w:b w:val="0"/>
+                <w:sz w:val="20"/>
+              </w:rPr>
+              <w:t>Dotação (composição: capital humano e ocupação)</w:t>
+            </w:r>
+          </w:p>
+        </w:tc>
+        <w:tc>
+          <w:tcPr>
+            <w:tcW w:type="dxa" w:w="4702"/>
+          </w:tcPr>
+          <w:p>
+            <w:pPr>
+              <w:jc w:val="center"/>
+            </w:pPr>
+            <w:r>
+              <w:rPr>
+                <w:rFonts w:ascii="Times New Roman" w:hAnsi="Times New Roman"/>
+                <w:b w:val="0"/>
+                <w:sz w:val="20"/>
+              </w:rPr>
+              <w:t>83,8</w:t>
+            </w:r>
+          </w:p>
+        </w:tc>
+      </w:tr>
+      <w:tr>
+        <w:tc>
+          <w:tcPr>
+            <w:tcW w:type="dxa" w:w="4702"/>
+          </w:tcPr>
+          <w:p>
+            <w:pPr>
+              <w:jc w:val="center"/>
+            </w:pPr>
+            <w:r>
+              <w:rPr>
+                <w:rFonts w:ascii="Times New Roman" w:hAnsi="Times New Roman"/>
+                <w:b w:val="0"/>
+                <w:sz w:val="20"/>
+              </w:rPr>
+              <w:t>Coeficiente (não explicado / discriminação)</w:t>
+            </w:r>
+          </w:p>
+        </w:tc>
+        <w:tc>
+          <w:tcPr>
+            <w:tcW w:type="dxa" w:w="4702"/>
+          </w:tcPr>
+          <w:p>
+            <w:pPr>
+              <w:jc w:val="center"/>
+            </w:pPr>
+            <w:r>
+              <w:rPr>
+                <w:rFonts w:ascii="Times New Roman" w:hAnsi="Times New Roman"/>
+                <w:b w:val="0"/>
+                <w:sz w:val="20"/>
+              </w:rPr>
+              <w:t>16,2</w:t>
+            </w:r>
+          </w:p>
+        </w:tc>
+      </w:tr>
+    </w:tbl>
+    <w:p>
+      <w:pPr>
+        <w:spacing w:after="160"/>
+      </w:pPr>
+    </w:p>
+    <w:p>
+      <w:pPr>
         <w:spacing w:before="120"/>
       </w:pPr>
       <w:r>
@@ -685,6 +1562,408 @@
       <w:r>
         <w:t>As duas primeiras camadas — acesso e território — combinam-se de forma agravada na interseção de raça e gênero. A decomposição interseccional mostra que a Mulher Negra acumula a maior desvantagem (gap de 96,4% vs. o Homem Branco) e, além disso, uma penalidade EXTRA de 9,5 pontos percentuais que não se reduz à soma das penalidades de raça e de gênero isoladas — a marca da interseccionalidade (Crenshaw, 1989). As camadas reforçam-se mutuamente: a barreira de acesso e o eixo territorial pesam de modo desigual sobre os diferentes grupos.</w:t>
       </w:r>
+    </w:p>
+    <w:p>
+      <w:pPr>
+        <w:spacing w:before="160"/>
+        <w:jc w:val="center"/>
+      </w:pPr>
+      <w:r>
+        <w:rPr>
+          <w:rFonts w:ascii="Times New Roman" w:hAnsi="Times New Roman"/>
+          <w:b/>
+          <w:sz w:val="20"/>
+        </w:rPr>
+        <w:t>Tabela 4. Decomposição interseccional (raça × gênero) do gap vs. o Homem Branco. Dotações + Retornos = 100% do gap. A Mulher Negra acumula o maior gap (96,4%) e uma penalidade extra de 9,5 p.p. não redutível à soma dos eixos de raça e gênero (Crenshaw, 1989).</w:t>
+      </w:r>
+    </w:p>
+    <w:tbl>
+      <w:tblPr>
+        <w:tblStyle w:val="TableGrid"/>
+        <w:tblW w:type="auto" w:w="0"/>
+        <w:jc w:val="center"/>
+        <w:tblLook w:firstColumn="1" w:firstRow="1" w:lastColumn="0" w:lastRow="0" w:noHBand="0" w:noVBand="1" w:val="04A0"/>
+      </w:tblPr>
+      <w:tblGrid>
+        <w:gridCol w:w="1881"/>
+        <w:gridCol w:w="1881"/>
+        <w:gridCol w:w="1881"/>
+        <w:gridCol w:w="1881"/>
+        <w:gridCol w:w="1881"/>
+      </w:tblGrid>
+      <w:tr>
+        <w:tc>
+          <w:tcPr>
+            <w:tcW w:type="dxa" w:w="1881"/>
+          </w:tcPr>
+          <w:p>
+            <w:pPr>
+              <w:jc w:val="center"/>
+            </w:pPr>
+            <w:r>
+              <w:rPr>
+                <w:rFonts w:ascii="Times New Roman" w:hAnsi="Times New Roman"/>
+                <w:b/>
+                <w:sz w:val="20"/>
+              </w:rPr>
+              <w:t>Grupo</w:t>
+            </w:r>
+          </w:p>
+        </w:tc>
+        <w:tc>
+          <w:tcPr>
+            <w:tcW w:type="dxa" w:w="1881"/>
+          </w:tcPr>
+          <w:p>
+            <w:pPr>
+              <w:jc w:val="center"/>
+            </w:pPr>
+            <w:r>
+              <w:rPr>
+                <w:rFonts w:ascii="Times New Roman" w:hAnsi="Times New Roman"/>
+                <w:b/>
+                <w:sz w:val="20"/>
+              </w:rPr>
+              <w:t>Gap vs HB (%)</w:t>
+            </w:r>
+          </w:p>
+        </w:tc>
+        <w:tc>
+          <w:tcPr>
+            <w:tcW w:type="dxa" w:w="1881"/>
+          </w:tcPr>
+          <w:p>
+            <w:pPr>
+              <w:jc w:val="center"/>
+            </w:pPr>
+            <w:r>
+              <w:rPr>
+                <w:rFonts w:ascii="Times New Roman" w:hAnsi="Times New Roman"/>
+                <w:b/>
+                <w:sz w:val="20"/>
+              </w:rPr>
+              <w:t>Dotações (%)</w:t>
+            </w:r>
+          </w:p>
+        </w:tc>
+        <w:tc>
+          <w:tcPr>
+            <w:tcW w:type="dxa" w:w="1881"/>
+          </w:tcPr>
+          <w:p>
+            <w:pPr>
+              <w:jc w:val="center"/>
+            </w:pPr>
+            <w:r>
+              <w:rPr>
+                <w:rFonts w:ascii="Times New Roman" w:hAnsi="Times New Roman"/>
+                <w:b/>
+                <w:sz w:val="20"/>
+              </w:rPr>
+              <w:t>Retornos (%)</w:t>
+            </w:r>
+          </w:p>
+        </w:tc>
+        <w:tc>
+          <w:tcPr>
+            <w:tcW w:type="dxa" w:w="1881"/>
+          </w:tcPr>
+          <w:p>
+            <w:pPr>
+              <w:jc w:val="center"/>
+            </w:pPr>
+            <w:r>
+              <w:rPr>
+                <w:rFonts w:ascii="Times New Roman" w:hAnsi="Times New Roman"/>
+                <w:b/>
+                <w:sz w:val="20"/>
+              </w:rPr>
+              <w:t>Penal. extra (p.p.)</w:t>
+            </w:r>
+          </w:p>
+        </w:tc>
+      </w:tr>
+      <w:tr>
+        <w:tc>
+          <w:tcPr>
+            <w:tcW w:type="dxa" w:w="1881"/>
+          </w:tcPr>
+          <w:p>
+            <w:pPr>
+              <w:jc w:val="center"/>
+            </w:pPr>
+            <w:r>
+              <w:rPr>
+                <w:rFonts w:ascii="Times New Roman" w:hAnsi="Times New Roman"/>
+                <w:b w:val="0"/>
+                <w:sz w:val="20"/>
+              </w:rPr>
+              <w:t>Mulher Branca</w:t>
+            </w:r>
+          </w:p>
+        </w:tc>
+        <w:tc>
+          <w:tcPr>
+            <w:tcW w:type="dxa" w:w="1881"/>
+          </w:tcPr>
+          <w:p>
+            <w:pPr>
+              <w:jc w:val="center"/>
+            </w:pPr>
+            <w:r>
+              <w:rPr>
+                <w:rFonts w:ascii="Times New Roman" w:hAnsi="Times New Roman"/>
+                <w:b w:val="0"/>
+                <w:sz w:val="20"/>
+              </w:rPr>
+              <w:t>46,6</w:t>
+            </w:r>
+          </w:p>
+        </w:tc>
+        <w:tc>
+          <w:tcPr>
+            <w:tcW w:type="dxa" w:w="1881"/>
+          </w:tcPr>
+          <w:p>
+            <w:pPr>
+              <w:jc w:val="center"/>
+            </w:pPr>
+            <w:r>
+              <w:rPr>
+                <w:rFonts w:ascii="Times New Roman" w:hAnsi="Times New Roman"/>
+                <w:b w:val="0"/>
+                <w:sz w:val="20"/>
+              </w:rPr>
+              <w:t>−8,9</w:t>
+            </w:r>
+          </w:p>
+        </w:tc>
+        <w:tc>
+          <w:tcPr>
+            <w:tcW w:type="dxa" w:w="1881"/>
+          </w:tcPr>
+          <w:p>
+            <w:pPr>
+              <w:jc w:val="center"/>
+            </w:pPr>
+            <w:r>
+              <w:rPr>
+                <w:rFonts w:ascii="Times New Roman" w:hAnsi="Times New Roman"/>
+                <w:b w:val="0"/>
+                <w:sz w:val="20"/>
+              </w:rPr>
+              <w:t>108,9</w:t>
+            </w:r>
+          </w:p>
+        </w:tc>
+        <w:tc>
+          <w:tcPr>
+            <w:tcW w:type="dxa" w:w="1881"/>
+          </w:tcPr>
+          <w:p>
+            <w:pPr>
+              <w:jc w:val="center"/>
+            </w:pPr>
+            <w:r>
+              <w:rPr>
+                <w:rFonts w:ascii="Times New Roman" w:hAnsi="Times New Roman"/>
+                <w:b w:val="0"/>
+                <w:sz w:val="20"/>
+              </w:rPr>
+              <w:t>—</w:t>
+            </w:r>
+          </w:p>
+        </w:tc>
+      </w:tr>
+      <w:tr>
+        <w:tc>
+          <w:tcPr>
+            <w:tcW w:type="dxa" w:w="1881"/>
+          </w:tcPr>
+          <w:p>
+            <w:pPr>
+              <w:jc w:val="center"/>
+            </w:pPr>
+            <w:r>
+              <w:rPr>
+                <w:rFonts w:ascii="Times New Roman" w:hAnsi="Times New Roman"/>
+                <w:b w:val="0"/>
+                <w:sz w:val="20"/>
+              </w:rPr>
+              <w:t>Homem Negro</w:t>
+            </w:r>
+          </w:p>
+        </w:tc>
+        <w:tc>
+          <w:tcPr>
+            <w:tcW w:type="dxa" w:w="1881"/>
+          </w:tcPr>
+          <w:p>
+            <w:pPr>
+              <w:jc w:val="center"/>
+            </w:pPr>
+            <w:r>
+              <w:rPr>
+                <w:rFonts w:ascii="Times New Roman" w:hAnsi="Times New Roman"/>
+                <w:b w:val="0"/>
+                <w:sz w:val="20"/>
+              </w:rPr>
+              <w:t>40,3</w:t>
+            </w:r>
+          </w:p>
+        </w:tc>
+        <w:tc>
+          <w:tcPr>
+            <w:tcW w:type="dxa" w:w="1881"/>
+          </w:tcPr>
+          <w:p>
+            <w:pPr>
+              <w:jc w:val="center"/>
+            </w:pPr>
+            <w:r>
+              <w:rPr>
+                <w:rFonts w:ascii="Times New Roman" w:hAnsi="Times New Roman"/>
+                <w:b w:val="0"/>
+                <w:sz w:val="20"/>
+              </w:rPr>
+              <w:t>70,9</w:t>
+            </w:r>
+          </w:p>
+        </w:tc>
+        <w:tc>
+          <w:tcPr>
+            <w:tcW w:type="dxa" w:w="1881"/>
+          </w:tcPr>
+          <w:p>
+            <w:pPr>
+              <w:jc w:val="center"/>
+            </w:pPr>
+            <w:r>
+              <w:rPr>
+                <w:rFonts w:ascii="Times New Roman" w:hAnsi="Times New Roman"/>
+                <w:b w:val="0"/>
+                <w:sz w:val="20"/>
+              </w:rPr>
+              <w:t>29,1</w:t>
+            </w:r>
+          </w:p>
+        </w:tc>
+        <w:tc>
+          <w:tcPr>
+            <w:tcW w:type="dxa" w:w="1881"/>
+          </w:tcPr>
+          <w:p>
+            <w:pPr>
+              <w:jc w:val="center"/>
+            </w:pPr>
+            <w:r>
+              <w:rPr>
+                <w:rFonts w:ascii="Times New Roman" w:hAnsi="Times New Roman"/>
+                <w:b w:val="0"/>
+                <w:sz w:val="20"/>
+              </w:rPr>
+              <w:t>—</w:t>
+            </w:r>
+          </w:p>
+        </w:tc>
+      </w:tr>
+      <w:tr>
+        <w:tc>
+          <w:tcPr>
+            <w:tcW w:type="dxa" w:w="1881"/>
+          </w:tcPr>
+          <w:p>
+            <w:pPr>
+              <w:jc w:val="center"/>
+            </w:pPr>
+            <w:r>
+              <w:rPr>
+                <w:rFonts w:ascii="Times New Roman" w:hAnsi="Times New Roman"/>
+                <w:b w:val="0"/>
+                <w:sz w:val="20"/>
+              </w:rPr>
+              <w:t>Mulher Negra</w:t>
+            </w:r>
+          </w:p>
+        </w:tc>
+        <w:tc>
+          <w:tcPr>
+            <w:tcW w:type="dxa" w:w="1881"/>
+          </w:tcPr>
+          <w:p>
+            <w:pPr>
+              <w:jc w:val="center"/>
+            </w:pPr>
+            <w:r>
+              <w:rPr>
+                <w:rFonts w:ascii="Times New Roman" w:hAnsi="Times New Roman"/>
+                <w:b w:val="0"/>
+                <w:sz w:val="20"/>
+              </w:rPr>
+              <w:t>96,4</w:t>
+            </w:r>
+          </w:p>
+        </w:tc>
+        <w:tc>
+          <w:tcPr>
+            <w:tcW w:type="dxa" w:w="1881"/>
+          </w:tcPr>
+          <w:p>
+            <w:pPr>
+              <w:jc w:val="center"/>
+            </w:pPr>
+            <w:r>
+              <w:rPr>
+                <w:rFonts w:ascii="Times New Roman" w:hAnsi="Times New Roman"/>
+                <w:b w:val="0"/>
+                <w:sz w:val="20"/>
+              </w:rPr>
+              <w:t>29,6</w:t>
+            </w:r>
+          </w:p>
+        </w:tc>
+        <w:tc>
+          <w:tcPr>
+            <w:tcW w:type="dxa" w:w="1881"/>
+          </w:tcPr>
+          <w:p>
+            <w:pPr>
+              <w:jc w:val="center"/>
+            </w:pPr>
+            <w:r>
+              <w:rPr>
+                <w:rFonts w:ascii="Times New Roman" w:hAnsi="Times New Roman"/>
+                <w:b w:val="0"/>
+                <w:sz w:val="20"/>
+              </w:rPr>
+              <w:t>70,4</w:t>
+            </w:r>
+          </w:p>
+        </w:tc>
+        <w:tc>
+          <w:tcPr>
+            <w:tcW w:type="dxa" w:w="1881"/>
+          </w:tcPr>
+          <w:p>
+            <w:pPr>
+              <w:jc w:val="center"/>
+            </w:pPr>
+            <w:r>
+              <w:rPr>
+                <w:rFonts w:ascii="Times New Roman" w:hAnsi="Times New Roman"/>
+                <w:b w:val="0"/>
+                <w:sz w:val="20"/>
+              </w:rPr>
+              <w:t>9,5</w:t>
+            </w:r>
+          </w:p>
+        </w:tc>
+      </w:tr>
+    </w:tbl>
+    <w:p>
+      <w:pPr>
+        <w:spacing w:after="160"/>
+      </w:pPr>
     </w:p>
     <w:p>
       <w:pPr>

</xml_diff>